<commit_message>
Finished the cover page
we just need to sign!
</commit_message>
<xml_diff>
--- a/Final/IEEE ESPC/AquaVision_IEEE_Blind.docx
+++ b/Final/IEEE ESPC/AquaVision_IEEE_Blind.docx
@@ -759,14 +759,7 @@
         <w:rPr>
           <w:rStyle w:val="IntenseEmphasis"/>
         </w:rPr>
-        <w:t xml:space="preserve">fish farms generates better productivity </w:t>
-      </w:r>
-      <w:r>
-        <w:rPr>
-          <w:rStyle w:val="IntenseEmphasis"/>
-        </w:rPr>
-        <w:lastRenderedPageBreak/>
-        <w:t xml:space="preserve">together with scalability and sustainability. According to a systematic </w:t>
+        <w:t xml:space="preserve">fish farms generates better productivity together with scalability and sustainability. According to a systematic </w:t>
       </w:r>
       <w:proofErr w:type="gramStart"/>
       <w:r>
@@ -1273,13 +1266,7 @@
         <w:rPr>
           <w:rStyle w:val="IntenseEmphasis"/>
         </w:rPr>
-        <w:t xml:space="preserve">efficiency </w:t>
-      </w:r>
-      <w:r>
-        <w:rPr>
-          <w:rStyle w:val="IntenseEmphasis"/>
-        </w:rPr>
-        <w:t>together with decreased human mistakes and reduced operational expenses in fish farming operations</w:t>
+        <w:t>efficiency together with decreased human mistakes and reduced operational expenses in fish farming operations</w:t>
       </w:r>
       <w:r>
         <w:rPr>
@@ -1759,7 +1746,6 @@
         <w:jc w:val="start"/>
       </w:pPr>
       <w:r>
-        <w:lastRenderedPageBreak/>
         <w:t xml:space="preserve">The </w:t>
       </w:r>
       <w:r>
@@ -2343,14 +2329,7 @@
           <w:rStyle w:val="IntenseEmphasis"/>
           <w:lang w:eastAsia="en-US"/>
         </w:rPr>
-        <w:t xml:space="preserve">The aquatic tanks function as the main habitat for cultured fish while the water filtration system operates to preserve water quality through removal of debris and oxygen level management. The pipeline system enables water to move efficiently between fish tanks and filtration units. The system </w:t>
-      </w:r>
-      <w:r>
-        <w:rPr>
-          <w:rStyle w:val="IntenseEmphasis"/>
-          <w:lang w:eastAsia="en-US"/>
-        </w:rPr>
-        <w:t>integrates plant cultivation to enable aquaponic practices which use fish waste as a natural fertilizer for plant growth. The system controls lighting to support both fish and plant growth and uses a water pump to control fluid movement and maintain system stability. The system achieves sustainable fish farming through the integrated operation of its components.</w:t>
+        <w:t>The aquatic tanks function as the main habitat for cultured fish while the water filtration system operates to preserve water quality through removal of debris and oxygen level management. The pipeline system enables water to move efficiently between fish tanks and filtration units. The system integrates plant cultivation to enable aquaponic practices which use fish waste as a natural fertilizer for plant growth. The system controls lighting to support both fish and plant growth and uses a water pump to control fluid movement and maintain system stability. The system achieves sustainable fish farming through the integrated operation of its components.</w:t>
       </w:r>
     </w:p>
     <w:p>
@@ -2792,7 +2771,6 @@
         <w:pStyle w:val="Heading1"/>
       </w:pPr>
       <w:r>
-        <w:lastRenderedPageBreak/>
         <w:t>CONCLUSION</w:t>
       </w:r>
     </w:p>
@@ -7519,7 +7497,7 @@
 </file>
 
 <file path=customXml/itemProps1.xml><?xml version="1.0" encoding="utf-8"?>
-<ds:datastoreItem xmlns:ds="http://purl.oclc.org/ooxml/officeDocument/customXml" ds:itemID="{271AD852-E0F3-4E5D-BE20-3DAE235FE254}">
+<ds:datastoreItem xmlns:ds="http://purl.oclc.org/ooxml/officeDocument/customXml" ds:itemID="{903D1301-E479-4A60-A309-FC4390E9A267}">
   <ds:schemaRefs>
     <ds:schemaRef ds:uri="http://schemas.openxmlformats.org/officeDocument/2006/bibliography"/>
   </ds:schemaRefs>

</xml_diff>